<commit_message>
docs: Translate the ingredient to chinese.
</commit_message>
<xml_diff>
--- a/400 HKD Meal Plan.docx
+++ b/400 HKD Meal Plan.docx
@@ -34,6 +34,42 @@
         </w:rPr>
         <w:t xml:space="preserve">Product: </w:t>
       </w:r>
+      <w:r>
+        <w:rPr>
+          <w:rFonts w:ascii="Arial" w:hAnsi="Arial" w:cs="Arial"/>
+          <w:b/>
+          <w:bCs/>
+          <w:szCs w:val="24"/>
+        </w:rPr>
+        <w:t>出前一丁麻油即食麵</w:t>
+      </w:r>
+      <w:r>
+        <w:rPr>
+          <w:rFonts w:ascii="Arial" w:hAnsi="Arial" w:cs="Arial"/>
+          <w:b/>
+          <w:bCs/>
+          <w:szCs w:val="24"/>
+        </w:rPr>
+        <w:t>91GM</w:t>
+      </w:r>
+      <w:r>
+        <w:rPr>
+          <w:rFonts w:ascii="Arial" w:hAnsi="Arial" w:cs="Arial"/>
+          <w:b/>
+          <w:bCs/>
+          <w:szCs w:val="24"/>
+        </w:rPr>
+        <w:t xml:space="preserve"> </w:t>
+      </w:r>
+      <w:r>
+        <w:rPr>
+          <w:rFonts w:ascii="Arial" w:hAnsi="Arial" w:cs="Arial"/>
+          <w:b/>
+          <w:bCs/>
+          <w:szCs w:val="24"/>
+        </w:rPr>
+        <w:t>(</w:t>
+      </w:r>
       <w:proofErr w:type="spellStart"/>
       <w:r>
         <w:rPr>
@@ -54,6 +90,15 @@
         </w:rPr>
         <w:t xml:space="preserve"> Sesame Oil Noodle 91GM</w:t>
       </w:r>
+      <w:r>
+        <w:rPr>
+          <w:rFonts w:ascii="Arial" w:hAnsi="Arial" w:cs="Arial"/>
+          <w:b/>
+          <w:bCs/>
+          <w:szCs w:val="24"/>
+        </w:rPr>
+        <w:t>)</w:t>
+      </w:r>
     </w:p>
     <w:p>
       <w:pPr>
@@ -160,6 +205,24 @@
       </w:r>
       <w:r>
         <w:rPr>
+          <w:rFonts w:ascii="Arial" w:hAnsi="Arial" w:cs="Arial" w:hint="eastAsia"/>
+          <w:b/>
+          <w:bCs/>
+          <w:szCs w:val="24"/>
+        </w:rPr>
+        <w:t>蝦子麵</w:t>
+      </w:r>
+      <w:r>
+        <w:rPr>
+          <w:rFonts w:ascii="Arial" w:hAnsi="Arial" w:cs="Arial"/>
+          <w:b/>
+          <w:bCs/>
+          <w:szCs w:val="24"/>
+        </w:rPr>
+        <w:t xml:space="preserve"> (</w:t>
+      </w:r>
+      <w:r>
+        <w:rPr>
           <w:rFonts w:ascii="Arial" w:hAnsi="Arial" w:cs="Arial"/>
           <w:b/>
           <w:bCs/>
@@ -167,6 +230,15 @@
         </w:rPr>
         <w:t>Shrimp Noodle</w:t>
       </w:r>
+      <w:r>
+        <w:rPr>
+          <w:rFonts w:ascii="Arial" w:hAnsi="Arial" w:cs="Arial"/>
+          <w:b/>
+          <w:bCs/>
+          <w:szCs w:val="24"/>
+        </w:rPr>
+        <w:t>)</w:t>
+      </w:r>
     </w:p>
     <w:p>
       <w:pPr>
@@ -257,8 +329,62 @@
           <w:bCs/>
           <w:szCs w:val="24"/>
         </w:rPr>
+        <w:t>Doux</w:t>
+      </w:r>
+      <w:r>
+        <w:rPr>
+          <w:rFonts w:ascii="Arial" w:hAnsi="Arial" w:cs="Arial"/>
+          <w:b/>
+          <w:bCs/>
+          <w:szCs w:val="24"/>
+        </w:rPr>
+        <w:t>法國雞肉腸原味</w:t>
+      </w:r>
+      <w:r>
+        <w:rPr>
+          <w:rFonts w:ascii="Arial" w:hAnsi="Arial" w:cs="Arial"/>
+          <w:b/>
+          <w:bCs/>
+          <w:szCs w:val="24"/>
+        </w:rPr>
+        <w:t xml:space="preserve"> 340GM</w:t>
+      </w:r>
+      <w:r>
+        <w:rPr>
+          <w:rFonts w:ascii="Arial" w:hAnsi="Arial" w:cs="Arial"/>
+          <w:b/>
+          <w:bCs/>
+          <w:szCs w:val="24"/>
+        </w:rPr>
+        <w:t xml:space="preserve"> </w:t>
+      </w:r>
+      <w:r>
+        <w:rPr>
+          <w:rFonts w:ascii="Arial" w:hAnsi="Arial" w:cs="Arial"/>
+          <w:b/>
+          <w:bCs/>
+          <w:szCs w:val="24"/>
+        </w:rPr>
+        <w:t>(</w:t>
+      </w:r>
+      <w:r>
+        <w:rPr>
+          <w:rFonts w:ascii="Arial" w:hAnsi="Arial" w:cs="Arial"/>
+          <w:b/>
+          <w:bCs/>
+          <w:szCs w:val="24"/>
+        </w:rPr>
         <w:t>Doux Chicken Franks 340GM</w:t>
       </w:r>
+      <w:r>
+        <w:rPr>
+          <w:rFonts w:ascii="Arial" w:hAnsi="Arial" w:cs="Arial"/>
+          <w:b/>
+          <w:bCs/>
+          <w:szCs w:val="24"/>
+        </w:rPr>
+        <w:t>)</w:t>
+      </w:r>
     </w:p>
     <w:p>
       <w:pPr>
@@ -396,6 +522,24 @@
       </w:r>
       <w:r>
         <w:rPr>
+          <w:rFonts w:ascii="Arial" w:hAnsi="Arial" w:cs="Arial" w:hint="eastAsia"/>
+          <w:b/>
+          <w:bCs/>
+          <w:szCs w:val="24"/>
+        </w:rPr>
+        <w:t>薯仔</w:t>
+      </w:r>
+      <w:r>
+        <w:rPr>
+          <w:rFonts w:ascii="Arial" w:hAnsi="Arial" w:cs="Arial"/>
+          <w:b/>
+          <w:bCs/>
+          <w:szCs w:val="24"/>
+        </w:rPr>
+        <w:t xml:space="preserve"> (</w:t>
+      </w:r>
+      <w:r>
+        <w:rPr>
           <w:rFonts w:ascii="Arial" w:hAnsi="Arial" w:cs="Arial"/>
           <w:b/>
           <w:bCs/>
@@ -403,6 +547,15 @@
         </w:rPr>
         <w:t>Potato</w:t>
       </w:r>
+      <w:r>
+        <w:rPr>
+          <w:rFonts w:ascii="Arial" w:hAnsi="Arial" w:cs="Arial"/>
+          <w:b/>
+          <w:bCs/>
+          <w:szCs w:val="24"/>
+        </w:rPr>
+        <w:t>)</w:t>
+      </w:r>
     </w:p>
     <w:p>
       <w:pPr>
@@ -498,6 +651,15 @@
           <w:szCs w:val="24"/>
         </w:rPr>
         <w:t xml:space="preserve">Product: </w:t>
+      </w:r>
+      <w:r>
+        <w:rPr>
+          <w:rFonts w:ascii="Arial" w:hAnsi="Arial" w:cs="Arial"/>
+          <w:b/>
+          <w:bCs/>
+          <w:szCs w:val="24"/>
+        </w:rPr>
+        <w:t>菜心</w:t>
       </w:r>
       <w:r>
         <w:rPr>
@@ -605,6 +767,15 @@
           <w:bCs/>
           <w:szCs w:val="24"/>
         </w:rPr>
+        <w:t>紅洋蔥</w:t>
+      </w:r>
+      <w:r>
+        <w:rPr>
+          <w:rFonts w:ascii="Arial" w:hAnsi="Arial" w:cs="Arial"/>
+          <w:b/>
+          <w:bCs/>
+          <w:szCs w:val="24"/>
+        </w:rPr>
         <w:t>Onion</w:t>
       </w:r>
       <w:r>
@@ -614,7 +785,7 @@
           <w:bCs/>
           <w:szCs w:val="24"/>
         </w:rPr>
-        <w:t xml:space="preserve"> (Choi Sum)</w:t>
+        <w:t xml:space="preserve"> </w:t>
       </w:r>
     </w:p>
     <w:p>
@@ -742,6 +913,24 @@
       </w:r>
       <w:r>
         <w:rPr>
+          <w:rFonts w:ascii="Arial" w:hAnsi="Arial" w:cs="Arial" w:hint="eastAsia"/>
+          <w:b/>
+          <w:bCs/>
+          <w:szCs w:val="24"/>
+        </w:rPr>
+        <w:t>雞扒</w:t>
+      </w:r>
+      <w:r>
+        <w:rPr>
+          <w:rFonts w:ascii="Arial" w:hAnsi="Arial" w:cs="Arial"/>
+          <w:b/>
+          <w:bCs/>
+          <w:szCs w:val="24"/>
+        </w:rPr>
+        <w:t xml:space="preserve"> (</w:t>
+      </w:r>
+      <w:r>
+        <w:rPr>
           <w:rFonts w:ascii="Arial" w:hAnsi="Arial" w:cs="Arial"/>
           <w:b/>
           <w:bCs/>
@@ -749,6 +938,15 @@
         </w:rPr>
         <w:t>Chicken Tights</w:t>
       </w:r>
+      <w:r>
+        <w:rPr>
+          <w:rFonts w:ascii="Arial" w:hAnsi="Arial" w:cs="Arial"/>
+          <w:b/>
+          <w:bCs/>
+          <w:szCs w:val="24"/>
+        </w:rPr>
+        <w:t>)</w:t>
+      </w:r>
     </w:p>
     <w:p>
       <w:pPr>
@@ -866,8 +1064,71 @@
           <w:bCs/>
           <w:szCs w:val="24"/>
         </w:rPr>
+        <w:t>金滿堂</w:t>
+      </w:r>
+      <w:r>
+        <w:rPr>
+          <w:rFonts w:ascii="Arial" w:hAnsi="Arial" w:cs="Arial"/>
+          <w:b/>
+          <w:bCs/>
+          <w:szCs w:val="24"/>
+        </w:rPr>
+        <w:t xml:space="preserve"> </w:t>
+      </w:r>
+      <w:r>
+        <w:rPr>
+          <w:rFonts w:ascii="Arial" w:hAnsi="Arial" w:cs="Arial"/>
+          <w:b/>
+          <w:bCs/>
+          <w:szCs w:val="24"/>
+        </w:rPr>
+        <w:t>頂級東北大米</w:t>
+      </w:r>
+      <w:r>
+        <w:rPr>
+          <w:rFonts w:ascii="Arial" w:hAnsi="Arial" w:cs="Arial"/>
+          <w:b/>
+          <w:bCs/>
+          <w:szCs w:val="24"/>
+        </w:rPr>
+        <w:t xml:space="preserve"> 3 KG</w:t>
+      </w:r>
+      <w:r>
+        <w:rPr>
+          <w:rFonts w:ascii="Arial" w:hAnsi="Arial" w:cs="Arial"/>
+          <w:b/>
+          <w:bCs/>
+          <w:szCs w:val="24"/>
+        </w:rPr>
+        <w:t xml:space="preserve"> </w:t>
+      </w:r>
+      <w:r>
+        <w:rPr>
+          <w:rFonts w:ascii="Arial" w:hAnsi="Arial" w:cs="Arial"/>
+          <w:b/>
+          <w:bCs/>
+          <w:szCs w:val="24"/>
+        </w:rPr>
+        <w:t>(</w:t>
+      </w:r>
+      <w:r>
+        <w:rPr>
+          <w:rFonts w:ascii="Arial" w:hAnsi="Arial" w:cs="Arial"/>
+          <w:b/>
+          <w:bCs/>
+          <w:szCs w:val="24"/>
+        </w:rPr>
         <w:t>Golden Hall Premium Short Grain White Rice 3KG</w:t>
       </w:r>
+      <w:r>
+        <w:rPr>
+          <w:rFonts w:ascii="Arial" w:hAnsi="Arial" w:cs="Arial"/>
+          <w:b/>
+          <w:bCs/>
+          <w:szCs w:val="24"/>
+        </w:rPr>
+        <w:t>)</w:t>
+      </w:r>
     </w:p>
     <w:p>
       <w:pPr>
@@ -964,8 +1225,53 @@
           <w:bCs/>
           <w:szCs w:val="24"/>
         </w:rPr>
+        <w:t>楊協成咖喱汁</w:t>
+      </w:r>
+      <w:r>
+        <w:rPr>
+          <w:rFonts w:ascii="Arial" w:hAnsi="Arial" w:cs="Arial"/>
+          <w:b/>
+          <w:bCs/>
+          <w:szCs w:val="24"/>
+        </w:rPr>
+        <w:t xml:space="preserve"> 400ML</w:t>
+      </w:r>
+      <w:r>
+        <w:rPr>
+          <w:rFonts w:ascii="Arial" w:hAnsi="Arial" w:cs="Arial"/>
+          <w:b/>
+          <w:bCs/>
+          <w:szCs w:val="24"/>
+        </w:rPr>
+        <w:t xml:space="preserve"> </w:t>
+      </w:r>
+      <w:r>
+        <w:rPr>
+          <w:rFonts w:ascii="Arial" w:hAnsi="Arial" w:cs="Arial"/>
+          <w:b/>
+          <w:bCs/>
+          <w:szCs w:val="24"/>
+        </w:rPr>
+        <w:t>(</w:t>
+      </w:r>
+      <w:r>
+        <w:rPr>
+          <w:rFonts w:ascii="Arial" w:hAnsi="Arial" w:cs="Arial"/>
+          <w:b/>
+          <w:bCs/>
+          <w:szCs w:val="24"/>
+        </w:rPr>
         <w:t>Yeo's Curry Gravy 400ML</w:t>
       </w:r>
+      <w:r>
+        <w:rPr>
+          <w:rFonts w:ascii="Arial" w:hAnsi="Arial" w:cs="Arial"/>
+          <w:b/>
+          <w:bCs/>
+          <w:szCs w:val="24"/>
+        </w:rPr>
+        <w:t>)</w:t>
+      </w:r>
     </w:p>
     <w:p>
       <w:pPr>
@@ -1092,7 +1398,70 @@
           <w:bCs/>
           <w:szCs w:val="24"/>
         </w:rPr>
+        <w:t>佳樂</w:t>
+      </w:r>
+      <w:r>
+        <w:rPr>
+          <w:rFonts w:ascii="Arial" w:hAnsi="Arial" w:cs="Arial"/>
+          <w:b/>
+          <w:bCs/>
+          <w:szCs w:val="24"/>
+        </w:rPr>
+        <w:t xml:space="preserve"> </w:t>
+      </w:r>
+      <w:r>
+        <w:rPr>
+          <w:rFonts w:ascii="Arial" w:hAnsi="Arial" w:cs="Arial"/>
+          <w:b/>
+          <w:bCs/>
+          <w:szCs w:val="24"/>
+        </w:rPr>
+        <w:t>三角盒裝純正椰漿</w:t>
+      </w:r>
+      <w:r>
+        <w:rPr>
+          <w:rFonts w:ascii="Arial" w:hAnsi="Arial" w:cs="Arial"/>
+          <w:b/>
+          <w:bCs/>
+          <w:szCs w:val="24"/>
+        </w:rPr>
+        <w:t xml:space="preserve"> 65 GM</w:t>
+      </w:r>
+      <w:r>
+        <w:rPr>
+          <w:rFonts w:ascii="Arial" w:hAnsi="Arial" w:cs="Arial"/>
+          <w:b/>
+          <w:bCs/>
+          <w:szCs w:val="24"/>
+        </w:rPr>
+        <w:t xml:space="preserve"> </w:t>
+      </w:r>
+      <w:r>
+        <w:rPr>
+          <w:rFonts w:ascii="Arial" w:hAnsi="Arial" w:cs="Arial"/>
+          <w:b/>
+          <w:bCs/>
+          <w:szCs w:val="24"/>
+        </w:rPr>
+        <w:t>(</w:t>
+      </w:r>
+      <w:r>
+        <w:rPr>
+          <w:rFonts w:ascii="Arial" w:hAnsi="Arial" w:cs="Arial"/>
+          <w:b/>
+          <w:bCs/>
+          <w:szCs w:val="24"/>
+        </w:rPr>
         <w:t>Kara UHT Coconut Cream 65GM</w:t>
+      </w:r>
+      <w:r>
+        <w:rPr>
+          <w:rFonts w:ascii="Arial" w:hAnsi="Arial" w:cs="Arial"/>
+          <w:b/>
+          <w:bCs/>
+          <w:szCs w:val="24"/>
+        </w:rPr>
+        <w:t>)</w:t>
       </w:r>
     </w:p>
     <w:p>
@@ -1288,6 +1657,7 @@
           <w:sz w:val="52"/>
           <w:szCs w:val="52"/>
         </w:rPr>
+        <w:lastRenderedPageBreak/>
         <w:br w:type="page"/>
       </w:r>
     </w:p>
@@ -3117,7 +3487,6 @@
   <w:style w:type="character" w:default="1" w:styleId="DefaultParagraphFont">
     <w:name w:val="Default Paragraph Font"/>
     <w:uiPriority w:val="1"/>
-    <w:semiHidden/>
     <w:unhideWhenUsed/>
   </w:style>
   <w:style w:type="table" w:default="1" w:styleId="TableNormal">

</xml_diff>

<commit_message>
docs: Remove the black pepper sauces.
</commit_message>
<xml_diff>
--- a/400 HKD Meal Plan.docx
+++ b/400 HKD Meal Plan.docx
@@ -440,20 +440,92 @@
           <w:rFonts w:ascii="Arial" w:hAnsi="Arial" w:cs="Arial"/>
           <w:szCs w:val="24"/>
         </w:rPr>
-        <w:t xml:space="preserve">(each packet 10 </w:t>
-      </w:r>
-      <w:proofErr w:type="spellStart"/>
-      <w:r>
-        <w:rPr>
-          <w:rFonts w:ascii="Arial" w:hAnsi="Arial" w:cs="Arial"/>
-          <w:szCs w:val="24"/>
-        </w:rPr>
-        <w:t>psc</w:t>
-      </w:r>
-      <w:proofErr w:type="spellEnd"/>
-      <w:r>
-        <w:rPr>
-          <w:rFonts w:ascii="Arial" w:hAnsi="Arial" w:cs="Arial"/>
+        <w:t>(each packet 10 psc)</w:t>
+      </w:r>
+    </w:p>
+    <w:p>
+      <w:pPr>
+        <w:rPr>
+          <w:rFonts w:ascii="Arial" w:hAnsi="Arial" w:cs="Arial"/>
+          <w:szCs w:val="24"/>
+        </w:rPr>
+      </w:pPr>
+      <w:r>
+        <w:rPr>
+          <w:rFonts w:ascii="Arial" w:hAnsi="Arial" w:cs="Arial"/>
+          <w:szCs w:val="24"/>
+        </w:rPr>
+        <w:t>Price: $</w:t>
+      </w:r>
+      <w:r>
+        <w:rPr>
+          <w:rFonts w:ascii="Arial" w:hAnsi="Arial" w:cs="Arial"/>
+          <w:szCs w:val="24"/>
+        </w:rPr>
+        <w:t>4</w:t>
+      </w:r>
+      <w:r>
+        <w:rPr>
+          <w:rFonts w:ascii="Arial" w:hAnsi="Arial" w:cs="Arial"/>
+          <w:szCs w:val="24"/>
+        </w:rPr>
+        <w:t>6</w:t>
+      </w:r>
+    </w:p>
+    <w:p>
+      <w:pPr>
+        <w:rPr>
+          <w:rFonts w:ascii="Arial" w:hAnsi="Arial" w:cs="Arial"/>
+          <w:szCs w:val="24"/>
+        </w:rPr>
+      </w:pPr>
+    </w:p>
+    <w:p>
+      <w:pPr>
+        <w:rPr>
+          <w:rFonts w:ascii="Arial" w:hAnsi="Arial" w:cs="Arial"/>
+          <w:szCs w:val="24"/>
+        </w:rPr>
+      </w:pPr>
+      <w:r>
+        <w:rPr>
+          <w:rFonts w:ascii="Arial" w:hAnsi="Arial" w:cs="Arial"/>
+          <w:szCs w:val="24"/>
+        </w:rPr>
+        <w:t xml:space="preserve">Product: </w:t>
+      </w:r>
+      <w:r>
+        <w:rPr>
+          <w:rFonts w:ascii="Arial" w:hAnsi="Arial" w:cs="Arial" w:hint="eastAsia"/>
+          <w:b/>
+          <w:bCs/>
+          <w:szCs w:val="24"/>
+        </w:rPr>
+        <w:t>薯仔</w:t>
+      </w:r>
+      <w:r>
+        <w:rPr>
+          <w:rFonts w:ascii="Arial" w:hAnsi="Arial" w:cs="Arial"/>
+          <w:b/>
+          <w:bCs/>
+          <w:szCs w:val="24"/>
+        </w:rPr>
+        <w:t xml:space="preserve"> (</w:t>
+      </w:r>
+      <w:r>
+        <w:rPr>
+          <w:rFonts w:ascii="Arial" w:hAnsi="Arial" w:cs="Arial"/>
+          <w:b/>
+          <w:bCs/>
+          <w:szCs w:val="24"/>
+        </w:rPr>
+        <w:t>Potato</w:t>
+      </w:r>
+      <w:r>
+        <w:rPr>
+          <w:rFonts w:ascii="Arial" w:hAnsi="Arial" w:cs="Arial"/>
+          <w:b/>
+          <w:bCs/>
           <w:szCs w:val="24"/>
         </w:rPr>
         <w:t>)</w:t>
@@ -471,6 +543,57 @@
           <w:rFonts w:ascii="Arial" w:hAnsi="Arial" w:cs="Arial"/>
           <w:szCs w:val="24"/>
         </w:rPr>
+        <w:t>Brought From: Chuk Yuen Market</w:t>
+      </w:r>
+    </w:p>
+    <w:p>
+      <w:pPr>
+        <w:rPr>
+          <w:rFonts w:ascii="Arial" w:hAnsi="Arial" w:cs="Arial"/>
+          <w:szCs w:val="24"/>
+        </w:rPr>
+      </w:pPr>
+      <w:r>
+        <w:rPr>
+          <w:rFonts w:ascii="Arial" w:hAnsi="Arial" w:cs="Arial"/>
+          <w:szCs w:val="24"/>
+        </w:rPr>
+        <w:t xml:space="preserve">Quantity: </w:t>
+      </w:r>
+      <w:r>
+        <w:rPr>
+          <w:rFonts w:ascii="Arial" w:hAnsi="Arial" w:cs="Arial"/>
+          <w:szCs w:val="24"/>
+        </w:rPr>
+        <w:t>1</w:t>
+      </w:r>
+      <w:r>
+        <w:rPr>
+          <w:rFonts w:ascii="Arial" w:hAnsi="Arial" w:cs="Arial"/>
+          <w:szCs w:val="24"/>
+        </w:rPr>
+        <w:t>5</w:t>
+      </w:r>
+      <w:r>
+        <w:rPr>
+          <w:rFonts w:ascii="Arial" w:hAnsi="Arial" w:cs="Arial"/>
+          <w:szCs w:val="24"/>
+        </w:rPr>
+        <w:t xml:space="preserve"> pcs ($4 for each)</w:t>
+      </w:r>
+    </w:p>
+    <w:p>
+      <w:pPr>
+        <w:rPr>
+          <w:rFonts w:ascii="Arial" w:hAnsi="Arial" w:cs="Arial"/>
+          <w:szCs w:val="24"/>
+        </w:rPr>
+      </w:pPr>
+      <w:r>
+        <w:rPr>
+          <w:rFonts w:ascii="Arial" w:hAnsi="Arial" w:cs="Arial"/>
+          <w:szCs w:val="24"/>
+        </w:rPr>
         <w:t>Price: $</w:t>
       </w:r>
       <w:r>
@@ -478,146 +601,14 @@
           <w:rFonts w:ascii="Arial" w:hAnsi="Arial" w:cs="Arial"/>
           <w:szCs w:val="24"/>
         </w:rPr>
-        <w:t>4</w:t>
-      </w:r>
-      <w:r>
-        <w:rPr>
-          <w:rFonts w:ascii="Arial" w:hAnsi="Arial" w:cs="Arial"/>
-          <w:szCs w:val="24"/>
-        </w:rPr>
         <w:t>6</w:t>
       </w:r>
-    </w:p>
-    <w:p>
-      <w:pPr>
-        <w:rPr>
-          <w:rFonts w:ascii="Arial" w:hAnsi="Arial" w:cs="Arial"/>
-          <w:szCs w:val="24"/>
-        </w:rPr>
-      </w:pPr>
-    </w:p>
-    <w:p>
-      <w:pPr>
-        <w:rPr>
-          <w:rFonts w:ascii="Arial" w:hAnsi="Arial" w:cs="Arial"/>
-          <w:szCs w:val="24"/>
-        </w:rPr>
-      </w:pPr>
-      <w:r>
-        <w:rPr>
-          <w:rFonts w:ascii="Arial" w:hAnsi="Arial" w:cs="Arial"/>
-          <w:szCs w:val="24"/>
-        </w:rPr>
-        <w:t xml:space="preserve">Product: </w:t>
-      </w:r>
-      <w:r>
-        <w:rPr>
-          <w:rFonts w:ascii="Arial" w:hAnsi="Arial" w:cs="Arial" w:hint="eastAsia"/>
-          <w:b/>
-          <w:bCs/>
-          <w:szCs w:val="24"/>
-        </w:rPr>
-        <w:t>薯仔</w:t>
-      </w:r>
-      <w:r>
-        <w:rPr>
-          <w:rFonts w:ascii="Arial" w:hAnsi="Arial" w:cs="Arial"/>
-          <w:b/>
-          <w:bCs/>
-          <w:szCs w:val="24"/>
-        </w:rPr>
-        <w:t xml:space="preserve"> (</w:t>
-      </w:r>
-      <w:r>
-        <w:rPr>
-          <w:rFonts w:ascii="Arial" w:hAnsi="Arial" w:cs="Arial"/>
-          <w:b/>
-          <w:bCs/>
-          <w:szCs w:val="24"/>
-        </w:rPr>
-        <w:t>Potato</w:t>
-      </w:r>
-      <w:r>
-        <w:rPr>
-          <w:rFonts w:ascii="Arial" w:hAnsi="Arial" w:cs="Arial"/>
-          <w:b/>
-          <w:bCs/>
-          <w:szCs w:val="24"/>
-        </w:rPr>
-        <w:t>)</w:t>
-      </w:r>
-    </w:p>
-    <w:p>
-      <w:pPr>
-        <w:rPr>
-          <w:rFonts w:ascii="Arial" w:hAnsi="Arial" w:cs="Arial"/>
-          <w:szCs w:val="24"/>
-        </w:rPr>
-      </w:pPr>
-      <w:r>
-        <w:rPr>
-          <w:rFonts w:ascii="Arial" w:hAnsi="Arial" w:cs="Arial"/>
-          <w:szCs w:val="24"/>
-        </w:rPr>
-        <w:t>Brought From: Chuk Yuen Market</w:t>
-      </w:r>
-    </w:p>
-    <w:p>
-      <w:pPr>
-        <w:rPr>
-          <w:rFonts w:ascii="Arial" w:hAnsi="Arial" w:cs="Arial"/>
-          <w:szCs w:val="24"/>
-        </w:rPr>
-      </w:pPr>
-      <w:r>
-        <w:rPr>
-          <w:rFonts w:ascii="Arial" w:hAnsi="Arial" w:cs="Arial"/>
-          <w:szCs w:val="24"/>
-        </w:rPr>
-        <w:t xml:space="preserve">Quantity: </w:t>
-      </w:r>
-      <w:r>
-        <w:rPr>
-          <w:rFonts w:ascii="Arial" w:hAnsi="Arial" w:cs="Arial"/>
-          <w:szCs w:val="24"/>
-        </w:rPr>
-        <w:t>1</w:t>
-      </w:r>
-      <w:r>
-        <w:rPr>
-          <w:rFonts w:ascii="Arial" w:hAnsi="Arial" w:cs="Arial"/>
-          <w:szCs w:val="24"/>
-        </w:rPr>
-        <w:t>6</w:t>
-      </w:r>
-      <w:r>
-        <w:rPr>
-          <w:rFonts w:ascii="Arial" w:hAnsi="Arial" w:cs="Arial"/>
-          <w:szCs w:val="24"/>
-        </w:rPr>
-        <w:t xml:space="preserve"> pcs ($4 for each)</w:t>
-      </w:r>
-    </w:p>
-    <w:p>
-      <w:pPr>
-        <w:rPr>
-          <w:rFonts w:ascii="Arial" w:hAnsi="Arial" w:cs="Arial"/>
-          <w:szCs w:val="24"/>
-        </w:rPr>
-      </w:pPr>
-      <w:r>
-        <w:rPr>
-          <w:rFonts w:ascii="Arial" w:hAnsi="Arial" w:cs="Arial"/>
-          <w:szCs w:val="24"/>
-        </w:rPr>
-        <w:t>Price: $</w:t>
-      </w:r>
-      <w:r>
-        <w:rPr>
-          <w:rFonts w:ascii="Arial" w:hAnsi="Arial" w:cs="Arial"/>
-          <w:szCs w:val="24"/>
-        </w:rPr>
-        <w:t>64</w:t>
+      <w:r>
+        <w:rPr>
+          <w:rFonts w:ascii="Arial" w:hAnsi="Arial" w:cs="Arial"/>
+          <w:szCs w:val="24"/>
+        </w:rPr>
+        <w:t>0</w:t>
       </w:r>
     </w:p>
     <w:p>
@@ -1355,155 +1346,6 @@
           <w:szCs w:val="24"/>
         </w:rPr>
       </w:pPr>
-    </w:p>
-    <w:p>
-      <w:pPr>
-        <w:rPr>
-          <w:rFonts w:ascii="Arial" w:hAnsi="Arial" w:cs="Arial"/>
-          <w:szCs w:val="24"/>
-        </w:rPr>
-      </w:pPr>
-      <w:r>
-        <w:rPr>
-          <w:rFonts w:ascii="Arial" w:hAnsi="Arial" w:cs="Arial"/>
-          <w:szCs w:val="24"/>
-        </w:rPr>
-        <w:t xml:space="preserve">Product: </w:t>
-      </w:r>
-      <w:r>
-        <w:rPr>
-          <w:rFonts w:ascii="Arial" w:hAnsi="Arial" w:cs="Arial"/>
-          <w:b/>
-          <w:bCs/>
-          <w:szCs w:val="24"/>
-        </w:rPr>
-        <w:t>李錦記黑椒汁</w:t>
-      </w:r>
-      <w:r>
-        <w:rPr>
-          <w:rFonts w:ascii="Arial" w:hAnsi="Arial" w:cs="Arial"/>
-          <w:b/>
-          <w:bCs/>
-          <w:szCs w:val="24"/>
-        </w:rPr>
-        <w:t xml:space="preserve"> 230GM</w:t>
-      </w:r>
-      <w:r>
-        <w:rPr>
-          <w:rFonts w:ascii="Arial" w:hAnsi="Arial" w:cs="Arial"/>
-          <w:b/>
-          <w:bCs/>
-          <w:szCs w:val="24"/>
-        </w:rPr>
-        <w:t xml:space="preserve"> (</w:t>
-      </w:r>
-      <w:r>
-        <w:rPr>
-          <w:rFonts w:ascii="Arial" w:hAnsi="Arial" w:cs="Arial"/>
-          <w:b/>
-          <w:bCs/>
-          <w:szCs w:val="24"/>
-        </w:rPr>
-        <w:t>Lee Kum Kee Jar Black Pepper 230GM</w:t>
-      </w:r>
-      <w:r>
-        <w:rPr>
-          <w:rFonts w:ascii="Arial" w:hAnsi="Arial" w:cs="Arial"/>
-          <w:b/>
-          <w:bCs/>
-          <w:szCs w:val="24"/>
-        </w:rPr>
-        <w:t>)</w:t>
-      </w:r>
-    </w:p>
-    <w:p>
-      <w:pPr>
-        <w:rPr>
-          <w:rFonts w:ascii="Arial" w:hAnsi="Arial" w:cs="Arial"/>
-          <w:szCs w:val="24"/>
-        </w:rPr>
-      </w:pPr>
-      <w:r>
-        <w:rPr>
-          <w:rFonts w:ascii="Arial" w:hAnsi="Arial" w:cs="Arial"/>
-          <w:szCs w:val="24"/>
-        </w:rPr>
-        <w:t xml:space="preserve">Brought From: </w:t>
-      </w:r>
-      <w:r>
-        <w:rPr>
-          <w:rFonts w:ascii="Arial" w:hAnsi="Arial" w:cs="Arial"/>
-          <w:szCs w:val="24"/>
-        </w:rPr>
-        <w:t>W</w:t>
-      </w:r>
-      <w:r>
-        <w:rPr>
-          <w:rFonts w:ascii="Arial" w:hAnsi="Arial" w:cs="Arial"/>
-          <w:szCs w:val="24"/>
-        </w:rPr>
-        <w:t>ellcome supermarket</w:t>
-      </w:r>
-    </w:p>
-    <w:p>
-      <w:pPr>
-        <w:rPr>
-          <w:rFonts w:ascii="Arial" w:hAnsi="Arial" w:cs="Arial"/>
-          <w:szCs w:val="24"/>
-        </w:rPr>
-      </w:pPr>
-      <w:r>
-        <w:rPr>
-          <w:rFonts w:ascii="Arial" w:hAnsi="Arial" w:cs="Arial"/>
-          <w:szCs w:val="24"/>
-        </w:rPr>
-        <w:t xml:space="preserve">Quantity: 1 </w:t>
-      </w:r>
-      <w:r>
-        <w:rPr>
-          <w:rFonts w:ascii="Arial" w:hAnsi="Arial" w:cs="Arial"/>
-          <w:szCs w:val="24"/>
-        </w:rPr>
-        <w:t>bottle</w:t>
-      </w:r>
-    </w:p>
-    <w:p>
-      <w:pPr>
-        <w:rPr>
-          <w:rFonts w:ascii="Arial" w:hAnsi="Arial" w:cs="Arial"/>
-          <w:szCs w:val="24"/>
-        </w:rPr>
-      </w:pPr>
-      <w:r>
-        <w:rPr>
-          <w:rFonts w:ascii="Arial" w:hAnsi="Arial" w:cs="Arial"/>
-          <w:szCs w:val="24"/>
-        </w:rPr>
-        <w:t>Price: $1</w:t>
-      </w:r>
-      <w:r>
-        <w:rPr>
-          <w:rFonts w:ascii="Arial" w:hAnsi="Arial" w:cs="Arial"/>
-          <w:szCs w:val="24"/>
-        </w:rPr>
-        <w:t>8</w:t>
-      </w:r>
-    </w:p>
-    <w:p>
-      <w:pPr>
-        <w:rPr>
-          <w:rFonts w:ascii="Arial" w:hAnsi="Arial" w:cs="Arial"/>
-          <w:szCs w:val="24"/>
-        </w:rPr>
-      </w:pPr>
-    </w:p>
-    <w:p>
-      <w:pPr>
-        <w:rPr>
-          <w:rFonts w:ascii="Arial" w:hAnsi="Arial" w:cs="Arial"/>
-          <w:szCs w:val="24"/>
-        </w:rPr>
-      </w:pPr>
       <w:r>
         <w:rPr>
           <w:rFonts w:ascii="Arial" w:hAnsi="Arial" w:cs="Arial"/>
@@ -1780,7 +1622,7 @@
           <w:rFonts w:ascii="Arial" w:hAnsi="Arial" w:cs="Arial"/>
           <w:szCs w:val="24"/>
         </w:rPr>
-        <w:t>1</w:t>
+        <w:t>2</w:t>
       </w:r>
       <w:r>
         <w:rPr>
@@ -1796,6 +1638,13 @@
         </w:rPr>
         <w:t>bottle</w:t>
       </w:r>
+      <w:r>
+        <w:rPr>
+          <w:rFonts w:ascii="Arial" w:hAnsi="Arial" w:cs="Arial"/>
+          <w:szCs w:val="24"/>
+        </w:rPr>
+        <w:t>s</w:t>
+      </w:r>
     </w:p>
     <w:p>
       <w:pPr>
@@ -1816,7 +1665,7 @@
           <w:rFonts w:ascii="Arial" w:hAnsi="Arial" w:cs="Arial"/>
           <w:szCs w:val="24"/>
         </w:rPr>
-        <w:t>18</w:t>
+        <w:t>36</w:t>
       </w:r>
     </w:p>
     <w:p>
@@ -1948,7 +1797,7 @@
           <w:rFonts w:ascii="Arial" w:hAnsi="Arial" w:cs="Arial"/>
           <w:szCs w:val="24"/>
         </w:rPr>
-        <w:t>1</w:t>
+        <w:t>2</w:t>
       </w:r>
       <w:r>
         <w:rPr>
@@ -1977,7 +1826,7 @@
           <w:rFonts w:ascii="Arial" w:hAnsi="Arial" w:cs="Arial"/>
           <w:szCs w:val="24"/>
         </w:rPr>
-        <w:t>6</w:t>
+        <w:t>12</w:t>
       </w:r>
     </w:p>
     <w:p>
@@ -2047,7 +1896,7 @@
           <w:color w:val="4C94D8" w:themeColor="text2" w:themeTint="80"/>
           <w:szCs w:val="24"/>
         </w:rPr>
-        <w:t>399</w:t>
+        <w:t>401</w:t>
       </w:r>
       <w:r>
         <w:rPr>
@@ -2538,14 +2387,7 @@
           <w:rFonts w:ascii="Arial" w:hAnsi="Arial" w:cs="Arial"/>
           <w:szCs w:val="24"/>
         </w:rPr>
-        <w:t xml:space="preserve">     Meal </w:t>
-      </w:r>
-      <w:r>
-        <w:rPr>
-          <w:rFonts w:ascii="Arial" w:hAnsi="Arial" w:cs="Arial"/>
-          <w:szCs w:val="24"/>
-        </w:rPr>
-        <w:t>2</w:t>
+        <w:t xml:space="preserve">     Meal 2</w:t>
       </w:r>
       <w:r>
         <w:rPr>
@@ -2559,14 +2401,7 @@
           <w:rFonts w:ascii="Arial" w:hAnsi="Arial" w:cs="Arial"/>
           <w:szCs w:val="24"/>
         </w:rPr>
-        <w:t xml:space="preserve">– </w:t>
-      </w:r>
-      <w:r>
-        <w:rPr>
-          <w:rFonts w:ascii="Arial" w:hAnsi="Arial" w:cs="Arial"/>
-          <w:szCs w:val="24"/>
-        </w:rPr>
-        <w:t>Shrimp</w:t>
+        <w:t>– Shrimp</w:t>
       </w:r>
       <w:r>
         <w:rPr>
@@ -2918,7 +2753,7 @@
           <w:rFonts w:ascii="Arial" w:hAnsi="Arial" w:cs="Arial"/>
           <w:szCs w:val="24"/>
         </w:rPr>
-        <w:t>8</w:t>
+        <w:t>15</w:t>
       </w:r>
       <w:r>
         <w:rPr>
@@ -2991,14 +2826,28 @@
           <w:rFonts w:ascii="Arial" w:hAnsi="Arial" w:cs="Arial"/>
           <w:szCs w:val="24"/>
         </w:rPr>
-        <w:t>1</w:t>
-      </w:r>
-      <w:r>
-        <w:rPr>
-          <w:rFonts w:ascii="Arial" w:hAnsi="Arial" w:cs="Arial"/>
-          <w:szCs w:val="24"/>
-        </w:rPr>
-        <w:t xml:space="preserve"> bottle, </w:t>
+        <w:t>2</w:t>
+      </w:r>
+      <w:r>
+        <w:rPr>
+          <w:rFonts w:ascii="Arial" w:hAnsi="Arial" w:cs="Arial"/>
+          <w:szCs w:val="24"/>
+        </w:rPr>
+        <w:t xml:space="preserve"> bottle</w:t>
+      </w:r>
+      <w:r>
+        <w:rPr>
+          <w:rFonts w:ascii="Arial" w:hAnsi="Arial" w:cs="Arial"/>
+          <w:szCs w:val="24"/>
+        </w:rPr>
+        <w:t>s</w:t>
+      </w:r>
+      <w:r>
+        <w:rPr>
+          <w:rFonts w:ascii="Arial" w:hAnsi="Arial" w:cs="Arial"/>
+          <w:szCs w:val="24"/>
+        </w:rPr>
+        <w:t xml:space="preserve">, </w:t>
       </w:r>
       <w:r>
         <w:rPr>
@@ -3012,7 +2861,7 @@
           <w:rFonts w:ascii="Arial" w:hAnsi="Arial" w:cs="Arial"/>
           <w:szCs w:val="24"/>
         </w:rPr>
-        <w:t>3</w:t>
+        <w:t>5</w:t>
       </w:r>
       <w:r>
         <w:rPr>
@@ -3033,7 +2882,7 @@
           <w:rFonts w:ascii="Arial" w:hAnsi="Arial" w:cs="Arial"/>
           <w:szCs w:val="24"/>
         </w:rPr>
-        <w:t>2</w:t>
+        <w:t>5</w:t>
       </w:r>
       <w:r>
         <w:rPr>
@@ -3062,7 +2911,7 @@
           <w:rFonts w:ascii="Arial" w:hAnsi="Arial" w:cs="Arial"/>
           <w:szCs w:val="24"/>
         </w:rPr>
-        <w:t>2.5</w:t>
+        <w:t>5</w:t>
       </w:r>
       <w:r>
         <w:rPr>
@@ -3076,7 +2925,7 @@
           <w:rFonts w:ascii="Arial" w:hAnsi="Arial" w:cs="Arial"/>
           <w:szCs w:val="24"/>
         </w:rPr>
-        <w:t>1</w:t>
+        <w:t>2</w:t>
       </w:r>
       <w:r>
         <w:rPr>
@@ -3090,7 +2939,7 @@
           <w:rFonts w:ascii="Arial" w:hAnsi="Arial" w:cs="Arial"/>
           <w:szCs w:val="24"/>
         </w:rPr>
-        <w:t>1</w:t>
+        <w:t>2</w:t>
       </w:r>
       <w:r>
         <w:rPr>
@@ -3104,6 +2953,13 @@
           <w:rFonts w:ascii="Arial" w:hAnsi="Arial" w:cs="Arial"/>
           <w:szCs w:val="24"/>
         </w:rPr>
+        <w:t>s</w:t>
+      </w:r>
+      <w:r>
+        <w:rPr>
+          <w:rFonts w:ascii="Arial" w:hAnsi="Arial" w:cs="Arial"/>
+          <w:szCs w:val="24"/>
+        </w:rPr>
         <w:t xml:space="preserve"> </w:t>
       </w:r>
       <w:r>
@@ -3126,6 +2982,54 @@
           <w:szCs w:val="24"/>
         </w:rPr>
         <w:t>, salt</w:t>
+      </w:r>
+      <w:r>
+        <w:rPr>
+          <w:rFonts w:ascii="Arial" w:hAnsi="Arial" w:cs="Arial"/>
+          <w:szCs w:val="24"/>
+        </w:rPr>
+        <w:t>.</w:t>
+      </w:r>
+    </w:p>
+    <w:p>
+      <w:pPr>
+        <w:ind w:firstLine="360"/>
+        <w:jc w:val="both"/>
+        <w:rPr>
+          <w:rFonts w:ascii="Arial" w:hAnsi="Arial" w:cs="Arial"/>
+          <w:szCs w:val="24"/>
+        </w:rPr>
+      </w:pPr>
+      <w:r>
+        <w:rPr>
+          <w:rFonts w:ascii="Arial" w:hAnsi="Arial" w:cs="Arial"/>
+          <w:szCs w:val="24"/>
+        </w:rPr>
+        <w:tab/>
+        <w:t xml:space="preserve">        When cutting try to divide equally. One potato divides into 6 pieces, when </w:t>
+      </w:r>
+      <w:r>
+        <w:rPr>
+          <w:rFonts w:ascii="Arial" w:hAnsi="Arial" w:cs="Arial"/>
+          <w:szCs w:val="24"/>
+        </w:rPr>
+        <w:tab/>
+        <w:t xml:space="preserve">        serving, 2 bite sizes potato per meal. This also applies to apple and </w:t>
+      </w:r>
+      <w:r>
+        <w:rPr>
+          <w:rFonts w:ascii="Arial" w:hAnsi="Arial" w:cs="Arial"/>
+          <w:szCs w:val="24"/>
+        </w:rPr>
+        <w:tab/>
+      </w:r>
+      <w:r>
+        <w:rPr>
+          <w:rFonts w:ascii="Arial" w:hAnsi="Arial" w:cs="Arial"/>
+          <w:szCs w:val="24"/>
+        </w:rPr>
+        <w:tab/>
+        <w:t xml:space="preserve">        chicken.</w:t>
       </w:r>
     </w:p>
     <w:p>
@@ -3300,56 +3204,8 @@
           <w:rFonts w:ascii="Arial" w:hAnsi="Arial" w:cs="Arial"/>
           <w:szCs w:val="24"/>
         </w:rPr>
-        <w:t>Fill the pot with water</w:t>
-      </w:r>
-      <w:r>
-        <w:rPr>
-          <w:rFonts w:ascii="Arial" w:hAnsi="Arial" w:cs="Arial"/>
-          <w:szCs w:val="24"/>
-        </w:rPr>
-        <w:t xml:space="preserve"> (fill up to almost full of the pot</w:t>
-      </w:r>
-      <w:r>
-        <w:rPr>
-          <w:rFonts w:ascii="Arial" w:hAnsi="Arial" w:cs="Arial"/>
-          <w:szCs w:val="24"/>
-        </w:rPr>
-        <w:t xml:space="preserve"> ~ </w:t>
-      </w:r>
-      <w:r>
-        <w:rPr>
-          <w:rFonts w:ascii="Arial" w:hAnsi="Arial" w:cs="Arial"/>
-          <w:szCs w:val="24"/>
-        </w:rPr>
-        <w:t>1</w:t>
-      </w:r>
-      <w:r>
-        <w:rPr>
-          <w:rFonts w:ascii="Arial" w:hAnsi="Arial" w:cs="Arial"/>
-          <w:szCs w:val="24"/>
-        </w:rPr>
-        <w:t>2</w:t>
-      </w:r>
-      <w:r>
-        <w:rPr>
-          <w:rFonts w:ascii="Arial" w:hAnsi="Arial" w:cs="Arial"/>
-          <w:szCs w:val="24"/>
-        </w:rPr>
-        <w:t>00ml</w:t>
-      </w:r>
-      <w:r>
-        <w:rPr>
-          <w:rFonts w:ascii="Arial" w:hAnsi="Arial" w:cs="Arial"/>
-          <w:szCs w:val="24"/>
-        </w:rPr>
-        <w:t>)</w:t>
-      </w:r>
-      <w:r>
-        <w:rPr>
-          <w:rFonts w:ascii="Arial" w:hAnsi="Arial" w:cs="Arial"/>
-          <w:szCs w:val="24"/>
-        </w:rPr>
-        <w:t>.</w:t>
+        <w:lastRenderedPageBreak/>
+        <w:t>Fried the Potato and Apple.</w:t>
       </w:r>
     </w:p>
     <w:p>
@@ -3370,14 +3226,21 @@
           <w:rFonts w:ascii="Arial" w:hAnsi="Arial" w:cs="Arial"/>
           <w:szCs w:val="24"/>
         </w:rPr>
-        <w:t>Wait till water boils, a</w:t>
-      </w:r>
-      <w:r>
-        <w:rPr>
-          <w:rFonts w:ascii="Arial" w:hAnsi="Arial" w:cs="Arial"/>
-          <w:szCs w:val="24"/>
-        </w:rPr>
-        <w:t xml:space="preserve">dd </w:t>
+        <w:t>Fill the pot with water</w:t>
+      </w:r>
+      <w:r>
+        <w:rPr>
+          <w:rFonts w:ascii="Arial" w:hAnsi="Arial" w:cs="Arial"/>
+          <w:szCs w:val="24"/>
+        </w:rPr>
+        <w:t xml:space="preserve"> (fill up to almost full of the pot</w:t>
+      </w:r>
+      <w:r>
+        <w:rPr>
+          <w:rFonts w:ascii="Arial" w:hAnsi="Arial" w:cs="Arial"/>
+          <w:szCs w:val="24"/>
+        </w:rPr>
+        <w:t xml:space="preserve"> ~ </w:t>
       </w:r>
       <w:r>
         <w:rPr>
@@ -3391,21 +3254,28 @@
           <w:rFonts w:ascii="Arial" w:hAnsi="Arial" w:cs="Arial"/>
           <w:szCs w:val="24"/>
         </w:rPr>
-        <w:t xml:space="preserve"> </w:t>
-      </w:r>
-      <w:r>
-        <w:rPr>
-          <w:rFonts w:ascii="Arial" w:hAnsi="Arial" w:cs="Arial"/>
-          <w:szCs w:val="24"/>
-        </w:rPr>
-        <w:t>bottle</w:t>
-      </w:r>
-      <w:r>
-        <w:rPr>
-          <w:rFonts w:ascii="Arial" w:hAnsi="Arial" w:cs="Arial"/>
-          <w:szCs w:val="24"/>
-        </w:rPr>
-        <w:t xml:space="preserve"> of curry sauce into it.</w:t>
+        <w:t>2</w:t>
+      </w:r>
+      <w:r>
+        <w:rPr>
+          <w:rFonts w:ascii="Arial" w:hAnsi="Arial" w:cs="Arial"/>
+          <w:szCs w:val="24"/>
+        </w:rPr>
+        <w:t>00ml</w:t>
+      </w:r>
+      <w:r>
+        <w:rPr>
+          <w:rFonts w:ascii="Arial" w:hAnsi="Arial" w:cs="Arial"/>
+          <w:szCs w:val="24"/>
+        </w:rPr>
+        <w:t>)</w:t>
+      </w:r>
+      <w:r>
+        <w:rPr>
+          <w:rFonts w:ascii="Arial" w:hAnsi="Arial" w:cs="Arial"/>
+          <w:szCs w:val="24"/>
+        </w:rPr>
+        <w:t>.</w:t>
       </w:r>
     </w:p>
     <w:p>
@@ -3426,14 +3296,49 @@
           <w:rFonts w:ascii="Arial" w:hAnsi="Arial" w:cs="Arial"/>
           <w:szCs w:val="24"/>
         </w:rPr>
-        <w:t>Stir it as you keep boiling</w:t>
-      </w:r>
-      <w:r>
-        <w:rPr>
-          <w:rFonts w:ascii="Arial" w:hAnsi="Arial" w:cs="Arial"/>
-          <w:szCs w:val="24"/>
-        </w:rPr>
-        <w:t>.</w:t>
+        <w:t>Wait till water boils, a</w:t>
+      </w:r>
+      <w:r>
+        <w:rPr>
+          <w:rFonts w:ascii="Arial" w:hAnsi="Arial" w:cs="Arial"/>
+          <w:szCs w:val="24"/>
+        </w:rPr>
+        <w:t xml:space="preserve">dd </w:t>
+      </w:r>
+      <w:r>
+        <w:rPr>
+          <w:rFonts w:ascii="Arial" w:hAnsi="Arial" w:cs="Arial"/>
+          <w:szCs w:val="24"/>
+        </w:rPr>
+        <w:t>2</w:t>
+      </w:r>
+      <w:r>
+        <w:rPr>
+          <w:rFonts w:ascii="Arial" w:hAnsi="Arial" w:cs="Arial"/>
+          <w:szCs w:val="24"/>
+        </w:rPr>
+        <w:t xml:space="preserve"> </w:t>
+      </w:r>
+      <w:r>
+        <w:rPr>
+          <w:rFonts w:ascii="Arial" w:hAnsi="Arial" w:cs="Arial"/>
+          <w:szCs w:val="24"/>
+        </w:rPr>
+        <w:t>bottle</w:t>
+      </w:r>
+      <w:r>
+        <w:rPr>
+          <w:rFonts w:ascii="Arial" w:hAnsi="Arial" w:cs="Arial"/>
+          <w:szCs w:val="24"/>
+        </w:rPr>
+        <w:t>s</w:t>
+      </w:r>
+      <w:r>
+        <w:rPr>
+          <w:rFonts w:ascii="Arial" w:hAnsi="Arial" w:cs="Arial"/>
+          <w:szCs w:val="24"/>
+        </w:rPr>
+        <w:t xml:space="preserve"> of curry sauce into it.</w:t>
       </w:r>
     </w:p>
     <w:p>
@@ -3454,8 +3359,14 @@
           <w:rFonts w:ascii="Arial" w:hAnsi="Arial" w:cs="Arial"/>
           <w:szCs w:val="24"/>
         </w:rPr>
-        <w:lastRenderedPageBreak/>
-        <w:t>Add onion.</w:t>
+        <w:t>Stir it as you keep boiling</w:t>
+      </w:r>
+      <w:r>
+        <w:rPr>
+          <w:rFonts w:ascii="Arial" w:hAnsi="Arial" w:cs="Arial"/>
+          <w:szCs w:val="24"/>
+        </w:rPr>
+        <w:t>.</w:t>
       </w:r>
     </w:p>
     <w:p>
@@ -3476,49 +3387,14 @@
           <w:rFonts w:ascii="Arial" w:hAnsi="Arial" w:cs="Arial"/>
           <w:szCs w:val="24"/>
         </w:rPr>
-        <w:t xml:space="preserve">Add </w:t>
-      </w:r>
-      <w:r>
-        <w:rPr>
-          <w:rFonts w:ascii="Arial" w:hAnsi="Arial" w:cs="Arial"/>
-          <w:szCs w:val="24"/>
-        </w:rPr>
-        <w:t>1</w:t>
-      </w:r>
-      <w:r>
-        <w:rPr>
-          <w:rFonts w:ascii="Arial" w:hAnsi="Arial" w:cs="Arial"/>
-          <w:szCs w:val="24"/>
-        </w:rPr>
-        <w:t xml:space="preserve"> </w:t>
-      </w:r>
-      <w:r>
-        <w:rPr>
-          <w:rFonts w:ascii="Arial" w:hAnsi="Arial" w:cs="Arial"/>
-          <w:szCs w:val="24"/>
-        </w:rPr>
-        <w:t>packet:</w:t>
-      </w:r>
-      <w:r>
-        <w:rPr>
-          <w:rFonts w:ascii="Arial" w:hAnsi="Arial" w:cs="Arial"/>
-          <w:szCs w:val="24"/>
-        </w:rPr>
-        <w:t xml:space="preserve"> of coconut cream into it. keep boiling, the curry sauce will be very </w:t>
-      </w:r>
-      <w:r>
-        <w:rPr>
-          <w:rFonts w:ascii="Arial" w:hAnsi="Arial" w:cs="Arial"/>
-          <w:szCs w:val="24"/>
-        </w:rPr>
-        <w:t>condensed</w:t>
-      </w:r>
-      <w:r>
-        <w:rPr>
-          <w:rFonts w:ascii="Arial" w:hAnsi="Arial" w:cs="Arial"/>
-          <w:szCs w:val="24"/>
-        </w:rPr>
-        <w:t xml:space="preserve"> and thick.</w:t>
+        <w:t>Add onion</w:t>
+      </w:r>
+      <w:r>
+        <w:rPr>
+          <w:rFonts w:ascii="Arial" w:hAnsi="Arial" w:cs="Arial"/>
+          <w:szCs w:val="24"/>
+        </w:rPr>
+        <w:t>, potato and apple.</w:t>
       </w:r>
     </w:p>
     <w:p>
@@ -3539,7 +3415,70 @@
           <w:rFonts w:ascii="Arial" w:hAnsi="Arial" w:cs="Arial"/>
           <w:szCs w:val="24"/>
         </w:rPr>
-        <w:t>Add salt when necessary.</w:t>
+        <w:t xml:space="preserve">Add </w:t>
+      </w:r>
+      <w:r>
+        <w:rPr>
+          <w:rFonts w:ascii="Arial" w:hAnsi="Arial" w:cs="Arial"/>
+          <w:szCs w:val="24"/>
+        </w:rPr>
+        <w:t>2</w:t>
+      </w:r>
+      <w:r>
+        <w:rPr>
+          <w:rFonts w:ascii="Arial" w:hAnsi="Arial" w:cs="Arial"/>
+          <w:szCs w:val="24"/>
+        </w:rPr>
+        <w:t xml:space="preserve"> </w:t>
+      </w:r>
+      <w:r>
+        <w:rPr>
+          <w:rFonts w:ascii="Arial" w:hAnsi="Arial" w:cs="Arial"/>
+          <w:szCs w:val="24"/>
+        </w:rPr>
+        <w:t>packet</w:t>
+      </w:r>
+      <w:r>
+        <w:rPr>
+          <w:rFonts w:ascii="Arial" w:hAnsi="Arial" w:cs="Arial"/>
+          <w:szCs w:val="24"/>
+        </w:rPr>
+        <w:t>s</w:t>
+      </w:r>
+      <w:r>
+        <w:rPr>
+          <w:rFonts w:ascii="Arial" w:hAnsi="Arial" w:cs="Arial"/>
+          <w:szCs w:val="24"/>
+        </w:rPr>
+        <w:t>:</w:t>
+      </w:r>
+      <w:r>
+        <w:rPr>
+          <w:rFonts w:ascii="Arial" w:hAnsi="Arial" w:cs="Arial"/>
+          <w:szCs w:val="24"/>
+        </w:rPr>
+        <w:t xml:space="preserve"> of coconut cream into it. keep boiling, the curry sauce will be very </w:t>
+      </w:r>
+      <w:r>
+        <w:rPr>
+          <w:rFonts w:ascii="Arial" w:hAnsi="Arial" w:cs="Arial"/>
+          <w:szCs w:val="24"/>
+        </w:rPr>
+        <w:t>condensed</w:t>
+      </w:r>
+      <w:r>
+        <w:rPr>
+          <w:rFonts w:ascii="Arial" w:hAnsi="Arial" w:cs="Arial"/>
+          <w:szCs w:val="24"/>
+        </w:rPr>
+        <w:t xml:space="preserve"> and thick</w:t>
+      </w:r>
+      <w:r>
+        <w:rPr>
+          <w:rFonts w:ascii="Arial" w:hAnsi="Arial" w:cs="Arial"/>
+          <w:szCs w:val="24"/>
+        </w:rPr>
+        <w:t xml:space="preserve"> as you keep boiling.</w:t>
       </w:r>
     </w:p>
     <w:p>
@@ -3560,7 +3499,7 @@
           <w:rFonts w:ascii="Arial" w:hAnsi="Arial" w:cs="Arial"/>
           <w:szCs w:val="24"/>
         </w:rPr>
-        <w:t>When preparing for a meal, just fry the chicken, potato and apple, when serve, just pour the curry sauce on it.</w:t>
+        <w:t>Add salt when necessary.</w:t>
       </w:r>
     </w:p>
     <w:p>
@@ -3581,7 +3520,7 @@
           <w:rFonts w:ascii="Arial" w:hAnsi="Arial" w:cs="Arial"/>
           <w:szCs w:val="24"/>
         </w:rPr>
-        <w:t>Served with Rice.</w:t>
+        <w:t>When preparing for a meal, just fry the chicken, when serve, just pour the curry sauce on it.</w:t>
       </w:r>
     </w:p>
     <w:p>
@@ -3602,266 +3541,7 @@
           <w:rFonts w:ascii="Arial" w:hAnsi="Arial" w:cs="Arial"/>
           <w:szCs w:val="24"/>
         </w:rPr>
-        <w:t>For the remaining</w:t>
-      </w:r>
-      <w:r>
-        <w:rPr>
-          <w:rFonts w:ascii="Arial" w:hAnsi="Arial" w:cs="Arial"/>
-          <w:szCs w:val="24"/>
-        </w:rPr>
-        <w:t xml:space="preserve"> curry</w:t>
-      </w:r>
-      <w:r>
-        <w:rPr>
-          <w:rFonts w:ascii="Arial" w:hAnsi="Arial" w:cs="Arial"/>
-          <w:szCs w:val="24"/>
-        </w:rPr>
-        <w:t xml:space="preserve"> sauce, potato</w:t>
-      </w:r>
-      <w:r>
-        <w:rPr>
-          <w:rFonts w:ascii="Arial" w:hAnsi="Arial" w:cs="Arial"/>
-          <w:szCs w:val="24"/>
-        </w:rPr>
-        <w:t>, apple</w:t>
-      </w:r>
-      <w:r>
-        <w:rPr>
-          <w:rFonts w:ascii="Arial" w:hAnsi="Arial" w:cs="Arial"/>
-          <w:szCs w:val="24"/>
-        </w:rPr>
-        <w:t xml:space="preserve"> and chicken. Put inside the fridge</w:t>
-      </w:r>
-      <w:r>
-        <w:rPr>
-          <w:rFonts w:ascii="Arial" w:hAnsi="Arial" w:cs="Arial"/>
-          <w:szCs w:val="24"/>
-        </w:rPr>
-        <w:t>. When prepare next meal, you need to just fry the potato</w:t>
-      </w:r>
-      <w:r>
-        <w:rPr>
-          <w:rFonts w:ascii="Arial" w:hAnsi="Arial" w:cs="Arial"/>
-          <w:szCs w:val="24"/>
-        </w:rPr>
-        <w:t xml:space="preserve">, apple and </w:t>
-      </w:r>
-      <w:r>
-        <w:rPr>
-          <w:rFonts w:ascii="Arial" w:hAnsi="Arial" w:cs="Arial"/>
-          <w:szCs w:val="24"/>
-        </w:rPr>
-        <w:t>chicken and re-boil the curry sauce.</w:t>
-      </w:r>
-      <w:r>
-        <w:rPr>
-          <w:rFonts w:ascii="Arial" w:hAnsi="Arial" w:cs="Arial"/>
-          <w:szCs w:val="24"/>
-        </w:rPr>
-        <w:t xml:space="preserve"> </w:t>
-      </w:r>
-    </w:p>
-    <w:p>
-      <w:pPr>
-        <w:jc w:val="both"/>
-        <w:rPr>
-          <w:rFonts w:ascii="Arial" w:hAnsi="Arial" w:cs="Arial"/>
-          <w:szCs w:val="24"/>
-        </w:rPr>
-      </w:pPr>
-    </w:p>
-    <w:p>
-      <w:pPr>
-        <w:jc w:val="both"/>
-        <w:rPr>
-          <w:rFonts w:ascii="Arial" w:hAnsi="Arial" w:cs="Arial"/>
-          <w:szCs w:val="24"/>
-        </w:rPr>
-      </w:pPr>
-      <w:r>
-        <w:rPr>
-          <w:rFonts w:ascii="Arial" w:hAnsi="Arial" w:cs="Arial"/>
-          <w:szCs w:val="24"/>
-        </w:rPr>
-        <w:t xml:space="preserve">     </w:t>
-      </w:r>
-      <w:r>
-        <w:rPr>
-          <w:rFonts w:ascii="Arial" w:hAnsi="Arial" w:cs="Arial"/>
-          <w:szCs w:val="24"/>
-        </w:rPr>
-        <w:t xml:space="preserve">Meal 4 </w:t>
-      </w:r>
-      <w:r>
-        <w:rPr>
-          <w:rFonts w:ascii="Arial" w:hAnsi="Arial" w:cs="Arial"/>
-          <w:szCs w:val="24"/>
-        </w:rPr>
-        <w:t>– Black Pepper sauce with potato chicken (</w:t>
-      </w:r>
-      <w:r>
-        <w:rPr>
-          <w:rFonts w:ascii="Arial" w:hAnsi="Arial" w:cs="Arial"/>
-          <w:szCs w:val="24"/>
-        </w:rPr>
-        <w:t>7</w:t>
-      </w:r>
-      <w:r>
-        <w:rPr>
-          <w:rFonts w:ascii="Arial" w:hAnsi="Arial" w:cs="Arial"/>
-          <w:szCs w:val="24"/>
-        </w:rPr>
-        <w:t xml:space="preserve"> meals)</w:t>
-      </w:r>
-    </w:p>
-    <w:p>
-      <w:pPr>
-        <w:ind w:firstLine="360"/>
-        <w:jc w:val="both"/>
-        <w:rPr>
-          <w:rFonts w:ascii="Arial" w:hAnsi="Arial" w:cs="Arial"/>
-          <w:szCs w:val="24"/>
-        </w:rPr>
-      </w:pPr>
-      <w:r>
-        <w:rPr>
-          <w:rFonts w:ascii="Arial" w:hAnsi="Arial" w:cs="Arial"/>
-          <w:szCs w:val="24"/>
-        </w:rPr>
-        <w:t xml:space="preserve">Portion: Rice 100g, </w:t>
-      </w:r>
-      <w:r>
-        <w:rPr>
-          <w:rFonts w:ascii="Arial" w:hAnsi="Arial" w:cs="Arial"/>
-          <w:szCs w:val="24"/>
-        </w:rPr>
-        <w:t>L</w:t>
-      </w:r>
-      <w:r>
-        <w:rPr>
-          <w:rFonts w:ascii="Arial" w:hAnsi="Arial" w:cs="Arial"/>
-          <w:szCs w:val="24"/>
-        </w:rPr>
-        <w:t xml:space="preserve">ee </w:t>
-      </w:r>
-      <w:r>
-        <w:rPr>
-          <w:rFonts w:ascii="Arial" w:hAnsi="Arial" w:cs="Arial"/>
-          <w:szCs w:val="24"/>
-        </w:rPr>
-        <w:t>K</w:t>
-      </w:r>
-      <w:r>
-        <w:rPr>
-          <w:rFonts w:ascii="Arial" w:hAnsi="Arial" w:cs="Arial"/>
-          <w:szCs w:val="24"/>
-        </w:rPr>
-        <w:t xml:space="preserve">am </w:t>
-      </w:r>
-      <w:r>
-        <w:rPr>
-          <w:rFonts w:ascii="Arial" w:hAnsi="Arial" w:cs="Arial"/>
-          <w:szCs w:val="24"/>
-        </w:rPr>
-        <w:t>K</w:t>
-      </w:r>
-      <w:r>
-        <w:rPr>
-          <w:rFonts w:ascii="Arial" w:hAnsi="Arial" w:cs="Arial"/>
-          <w:szCs w:val="24"/>
-        </w:rPr>
-        <w:t xml:space="preserve">ee pepper sauce 1 bottle, potato </w:t>
-      </w:r>
-      <w:r>
-        <w:rPr>
-          <w:rFonts w:ascii="Arial" w:hAnsi="Arial" w:cs="Arial"/>
-          <w:szCs w:val="24"/>
-        </w:rPr>
-        <w:t>2</w:t>
-      </w:r>
-      <w:r>
-        <w:rPr>
-          <w:rFonts w:ascii="Arial" w:hAnsi="Arial" w:cs="Arial"/>
-          <w:szCs w:val="24"/>
-        </w:rPr>
-        <w:t xml:space="preserve"> pcs, apple </w:t>
-      </w:r>
-      <w:r>
-        <w:rPr>
-          <w:rFonts w:ascii="Arial" w:hAnsi="Arial" w:cs="Arial"/>
-          <w:szCs w:val="24"/>
-        </w:rPr>
-        <w:t>3</w:t>
-      </w:r>
-      <w:r>
-        <w:rPr>
-          <w:rFonts w:ascii="Arial" w:hAnsi="Arial" w:cs="Arial"/>
-          <w:szCs w:val="24"/>
-        </w:rPr>
-        <w:t xml:space="preserve"> </w:t>
-      </w:r>
-      <w:r>
-        <w:rPr>
-          <w:rFonts w:ascii="Arial" w:hAnsi="Arial" w:cs="Arial"/>
-          <w:szCs w:val="24"/>
-        </w:rPr>
-        <w:t xml:space="preserve">pcs, </w:t>
-      </w:r>
-      <w:r>
-        <w:rPr>
-          <w:rFonts w:ascii="Arial" w:hAnsi="Arial" w:cs="Arial"/>
-          <w:szCs w:val="24"/>
-        </w:rPr>
-        <w:tab/>
-      </w:r>
-      <w:r>
-        <w:rPr>
-          <w:rFonts w:ascii="Arial" w:hAnsi="Arial" w:cs="Arial"/>
-          <w:szCs w:val="24"/>
-        </w:rPr>
-        <w:t xml:space="preserve">        chicken </w:t>
-      </w:r>
-      <w:r>
-        <w:rPr>
-          <w:rFonts w:ascii="Arial" w:hAnsi="Arial" w:cs="Arial"/>
-          <w:szCs w:val="24"/>
-        </w:rPr>
-        <w:t>2.5</w:t>
-      </w:r>
-      <w:r>
-        <w:rPr>
-          <w:rFonts w:ascii="Arial" w:hAnsi="Arial" w:cs="Arial"/>
-          <w:szCs w:val="24"/>
-        </w:rPr>
-        <w:t xml:space="preserve"> large pcs, Onion </w:t>
-      </w:r>
-      <w:r>
-        <w:rPr>
-          <w:rFonts w:ascii="Arial" w:hAnsi="Arial" w:cs="Arial"/>
-          <w:szCs w:val="24"/>
-        </w:rPr>
-        <w:t>1</w:t>
-      </w:r>
-      <w:r>
-        <w:rPr>
-          <w:rFonts w:ascii="Arial" w:hAnsi="Arial" w:cs="Arial"/>
-          <w:szCs w:val="24"/>
-        </w:rPr>
-        <w:t xml:space="preserve"> large</w:t>
-      </w:r>
-      <w:r>
-        <w:rPr>
-          <w:rFonts w:ascii="Arial" w:hAnsi="Arial" w:cs="Arial"/>
-          <w:szCs w:val="24"/>
-        </w:rPr>
-        <w:t xml:space="preserve"> and</w:t>
-      </w:r>
-      <w:r>
-        <w:rPr>
-          <w:rFonts w:ascii="Arial" w:hAnsi="Arial" w:cs="Arial"/>
-          <w:szCs w:val="24"/>
-        </w:rPr>
-        <w:t xml:space="preserve"> salt</w:t>
+        <w:t>Served with Rice.</w:t>
       </w:r>
     </w:p>
     <w:p>
@@ -3869,7 +3549,7 @@
         <w:pStyle w:val="ListParagraph"/>
         <w:numPr>
           <w:ilvl w:val="0"/>
-          <w:numId w:val="8"/>
+          <w:numId w:val="2"/>
         </w:numPr>
         <w:jc w:val="both"/>
         <w:rPr>
@@ -3882,294 +3562,28 @@
           <w:rFonts w:ascii="Arial" w:hAnsi="Arial" w:cs="Arial"/>
           <w:szCs w:val="24"/>
         </w:rPr>
-        <w:t>Cook Rice (100 gram of raw rice)</w:t>
-      </w:r>
-    </w:p>
-    <w:p>
-      <w:pPr>
-        <w:pStyle w:val="ListParagraph"/>
-        <w:numPr>
-          <w:ilvl w:val="0"/>
-          <w:numId w:val="8"/>
-        </w:numPr>
-        <w:jc w:val="both"/>
-        <w:rPr>
-          <w:rFonts w:ascii="Arial" w:hAnsi="Arial" w:cs="Arial"/>
-          <w:szCs w:val="24"/>
-        </w:rPr>
-      </w:pPr>
-      <w:r>
-        <w:rPr>
-          <w:rFonts w:ascii="Arial" w:hAnsi="Arial" w:cs="Arial"/>
-          <w:szCs w:val="24"/>
-        </w:rPr>
-        <w:t>Cut the chicken into bite sizes.</w:t>
-      </w:r>
-    </w:p>
-    <w:p>
-      <w:pPr>
-        <w:pStyle w:val="ListParagraph"/>
-        <w:numPr>
-          <w:ilvl w:val="0"/>
-          <w:numId w:val="8"/>
-        </w:numPr>
-        <w:jc w:val="both"/>
-        <w:rPr>
-          <w:rFonts w:ascii="Arial" w:hAnsi="Arial" w:cs="Arial"/>
-          <w:szCs w:val="24"/>
-        </w:rPr>
-      </w:pPr>
-      <w:r>
-        <w:rPr>
-          <w:rFonts w:ascii="Arial" w:hAnsi="Arial" w:cs="Arial"/>
-          <w:szCs w:val="24"/>
-        </w:rPr>
-        <w:t>Cut the potato into bite sizes.</w:t>
-      </w:r>
-    </w:p>
-    <w:p>
-      <w:pPr>
-        <w:pStyle w:val="ListParagraph"/>
-        <w:numPr>
-          <w:ilvl w:val="0"/>
-          <w:numId w:val="8"/>
-        </w:numPr>
-        <w:jc w:val="both"/>
-        <w:rPr>
-          <w:rFonts w:ascii="Arial" w:hAnsi="Arial" w:cs="Arial"/>
-          <w:szCs w:val="24"/>
-        </w:rPr>
-      </w:pPr>
-      <w:r>
-        <w:rPr>
-          <w:rFonts w:ascii="Arial" w:hAnsi="Arial" w:cs="Arial"/>
-          <w:szCs w:val="24"/>
-        </w:rPr>
-        <w:t>Cut the apple into bite sizes.</w:t>
-      </w:r>
-    </w:p>
-    <w:p>
-      <w:pPr>
-        <w:pStyle w:val="ListParagraph"/>
-        <w:numPr>
-          <w:ilvl w:val="0"/>
-          <w:numId w:val="8"/>
-        </w:numPr>
-        <w:jc w:val="both"/>
-        <w:rPr>
-          <w:rFonts w:ascii="Arial" w:hAnsi="Arial" w:cs="Arial"/>
-          <w:szCs w:val="24"/>
-        </w:rPr>
-      </w:pPr>
-      <w:r>
-        <w:rPr>
-          <w:rFonts w:ascii="Arial" w:hAnsi="Arial" w:cs="Arial"/>
-          <w:szCs w:val="24"/>
-        </w:rPr>
-        <w:t>Ferment the chicken with salt and pepper.</w:t>
-      </w:r>
-    </w:p>
-    <w:p>
-      <w:pPr>
-        <w:pStyle w:val="ListParagraph"/>
-        <w:numPr>
-          <w:ilvl w:val="0"/>
-          <w:numId w:val="8"/>
-        </w:numPr>
-        <w:jc w:val="both"/>
-        <w:rPr>
-          <w:rFonts w:ascii="Arial" w:hAnsi="Arial" w:cs="Arial"/>
-          <w:szCs w:val="24"/>
-        </w:rPr>
-      </w:pPr>
-      <w:r>
-        <w:rPr>
-          <w:rFonts w:ascii="Arial" w:hAnsi="Arial" w:cs="Arial"/>
-          <w:szCs w:val="24"/>
-        </w:rPr>
-        <w:t>Cut the onion.</w:t>
-      </w:r>
-    </w:p>
-    <w:p>
-      <w:pPr>
-        <w:pStyle w:val="ListParagraph"/>
-        <w:numPr>
-          <w:ilvl w:val="0"/>
-          <w:numId w:val="8"/>
-        </w:numPr>
-        <w:jc w:val="both"/>
-        <w:rPr>
-          <w:rFonts w:ascii="Arial" w:hAnsi="Arial" w:cs="Arial"/>
-          <w:szCs w:val="24"/>
-        </w:rPr>
-      </w:pPr>
-      <w:r>
-        <w:rPr>
-          <w:rFonts w:ascii="Arial" w:hAnsi="Arial" w:cs="Arial"/>
-          <w:szCs w:val="24"/>
-        </w:rPr>
-        <w:t>Fried the onion till it is transparent.</w:t>
-      </w:r>
-    </w:p>
-    <w:p>
-      <w:pPr>
-        <w:pStyle w:val="ListParagraph"/>
-        <w:numPr>
-          <w:ilvl w:val="0"/>
-          <w:numId w:val="8"/>
-        </w:numPr>
-        <w:jc w:val="both"/>
-        <w:rPr>
-          <w:rFonts w:ascii="Arial" w:hAnsi="Arial" w:cs="Arial"/>
-          <w:szCs w:val="24"/>
-        </w:rPr>
-      </w:pPr>
-      <w:r>
-        <w:rPr>
-          <w:rFonts w:ascii="Arial" w:hAnsi="Arial" w:cs="Arial"/>
-          <w:szCs w:val="24"/>
-        </w:rPr>
-        <w:t>Fried the chicken, potato and apple.</w:t>
-      </w:r>
-    </w:p>
-    <w:p>
-      <w:pPr>
-        <w:pStyle w:val="ListParagraph"/>
-        <w:numPr>
-          <w:ilvl w:val="0"/>
-          <w:numId w:val="8"/>
-        </w:numPr>
-        <w:jc w:val="both"/>
-        <w:rPr>
-          <w:rFonts w:ascii="Arial" w:hAnsi="Arial" w:cs="Arial"/>
-          <w:szCs w:val="24"/>
-        </w:rPr>
-      </w:pPr>
-      <w:r>
-        <w:rPr>
-          <w:rFonts w:ascii="Arial" w:hAnsi="Arial" w:cs="Arial"/>
-          <w:szCs w:val="24"/>
-        </w:rPr>
-        <w:t>A</w:t>
-      </w:r>
-      <w:r>
-        <w:rPr>
-          <w:rFonts w:ascii="Arial" w:hAnsi="Arial" w:cs="Arial"/>
-          <w:szCs w:val="24"/>
-        </w:rPr>
-        <w:t xml:space="preserve">dd </w:t>
-      </w:r>
-      <w:r>
-        <w:rPr>
-          <w:rFonts w:ascii="Arial" w:hAnsi="Arial" w:cs="Arial"/>
-          <w:szCs w:val="24"/>
-        </w:rPr>
-        <w:t>some pepper sauce into the pot, add some water.</w:t>
-      </w:r>
-    </w:p>
-    <w:p>
-      <w:pPr>
-        <w:pStyle w:val="ListParagraph"/>
-        <w:numPr>
-          <w:ilvl w:val="0"/>
-          <w:numId w:val="8"/>
-        </w:numPr>
-        <w:jc w:val="both"/>
-        <w:rPr>
-          <w:rFonts w:ascii="Arial" w:hAnsi="Arial" w:cs="Arial"/>
-          <w:szCs w:val="24"/>
-        </w:rPr>
-      </w:pPr>
-      <w:r>
-        <w:rPr>
-          <w:rFonts w:ascii="Arial" w:hAnsi="Arial" w:cs="Arial"/>
-          <w:szCs w:val="24"/>
-        </w:rPr>
-        <w:t>Stir it as you keep boiling.</w:t>
-      </w:r>
-    </w:p>
-    <w:p>
-      <w:pPr>
-        <w:pStyle w:val="ListParagraph"/>
-        <w:numPr>
-          <w:ilvl w:val="0"/>
-          <w:numId w:val="8"/>
-        </w:numPr>
-        <w:jc w:val="both"/>
-        <w:rPr>
-          <w:rFonts w:ascii="Arial" w:hAnsi="Arial" w:cs="Arial"/>
-          <w:szCs w:val="24"/>
-        </w:rPr>
-      </w:pPr>
-      <w:r>
-        <w:rPr>
-          <w:rFonts w:ascii="Arial" w:hAnsi="Arial" w:cs="Arial"/>
-          <w:szCs w:val="24"/>
-        </w:rPr>
-        <w:t>Add onion</w:t>
-      </w:r>
-      <w:r>
-        <w:rPr>
-          <w:rFonts w:ascii="Arial" w:hAnsi="Arial" w:cs="Arial"/>
-          <w:szCs w:val="24"/>
-        </w:rPr>
-        <w:t>, chicken, potato and apple in the pepper sauce pot.</w:t>
-      </w:r>
-    </w:p>
-    <w:p>
-      <w:pPr>
-        <w:pStyle w:val="ListParagraph"/>
-        <w:numPr>
-          <w:ilvl w:val="0"/>
-          <w:numId w:val="8"/>
-        </w:numPr>
-        <w:jc w:val="both"/>
-        <w:rPr>
-          <w:rFonts w:ascii="Arial" w:hAnsi="Arial" w:cs="Arial"/>
-          <w:szCs w:val="24"/>
-        </w:rPr>
-      </w:pPr>
-      <w:r>
-        <w:rPr>
-          <w:rFonts w:ascii="Arial" w:hAnsi="Arial" w:cs="Arial"/>
-          <w:szCs w:val="24"/>
-        </w:rPr>
-        <w:t>Served with Rice.</w:t>
-      </w:r>
-    </w:p>
-    <w:p>
-      <w:pPr>
-        <w:pStyle w:val="ListParagraph"/>
-        <w:numPr>
-          <w:ilvl w:val="0"/>
-          <w:numId w:val="8"/>
-        </w:numPr>
-        <w:jc w:val="both"/>
-        <w:rPr>
-          <w:rFonts w:ascii="Arial" w:hAnsi="Arial" w:cs="Arial"/>
-          <w:szCs w:val="24"/>
-        </w:rPr>
-      </w:pPr>
-      <w:r>
-        <w:rPr>
-          <w:rFonts w:ascii="Arial" w:hAnsi="Arial" w:cs="Arial"/>
-          <w:szCs w:val="24"/>
-        </w:rPr>
-        <w:t xml:space="preserve">For the remaining </w:t>
-      </w:r>
-      <w:r>
-        <w:rPr>
-          <w:rFonts w:ascii="Arial" w:hAnsi="Arial" w:cs="Arial"/>
-          <w:szCs w:val="24"/>
-        </w:rPr>
-        <w:t>pepper</w:t>
-      </w:r>
-      <w:r>
-        <w:rPr>
-          <w:rFonts w:ascii="Arial" w:hAnsi="Arial" w:cs="Arial"/>
-          <w:szCs w:val="24"/>
-        </w:rPr>
-        <w:t xml:space="preserve"> sauce, potato, apple and chicken. Put inside the fridge. When prepare next meal, you need to just fry the potato, apple and chicken.</w:t>
+        <w:t>For the remaining</w:t>
+      </w:r>
+      <w:r>
+        <w:rPr>
+          <w:rFonts w:ascii="Arial" w:hAnsi="Arial" w:cs="Arial"/>
+          <w:szCs w:val="24"/>
+        </w:rPr>
+        <w:t xml:space="preserve"> curry</w:t>
+      </w:r>
+      <w:r>
+        <w:rPr>
+          <w:rFonts w:ascii="Arial" w:hAnsi="Arial" w:cs="Arial"/>
+          <w:szCs w:val="24"/>
+        </w:rPr>
+        <w:t xml:space="preserve"> sauce and chicken. Put inside the fridge</w:t>
+      </w:r>
+      <w:r>
+        <w:rPr>
+          <w:rFonts w:ascii="Arial" w:hAnsi="Arial" w:cs="Arial"/>
+          <w:szCs w:val="24"/>
+        </w:rPr>
+        <w:t>. When prepare next meal, you need to just fry the chicken and re-boil the curry sauce.</w:t>
       </w:r>
       <w:r>
         <w:rPr>
@@ -4177,13 +3591,6 @@
           <w:szCs w:val="24"/>
         </w:rPr>
         <w:t xml:space="preserve"> </w:t>
-      </w:r>
-      <w:r>
-        <w:rPr>
-          <w:rFonts w:ascii="Arial" w:hAnsi="Arial" w:cs="Arial"/>
-          <w:szCs w:val="24"/>
-        </w:rPr>
-        <w:t>Re-boiled the sauce.</w:t>
       </w:r>
     </w:p>
     <w:p>
@@ -4208,7 +3615,21 @@
           <w:rFonts w:ascii="Arial" w:hAnsi="Arial" w:cs="Arial"/>
           <w:szCs w:val="24"/>
         </w:rPr>
-        <w:t xml:space="preserve">Meal 5 </w:t>
+        <w:t xml:space="preserve">Meal </w:t>
+      </w:r>
+      <w:r>
+        <w:rPr>
+          <w:rFonts w:ascii="Arial" w:hAnsi="Arial" w:cs="Arial"/>
+          <w:szCs w:val="24"/>
+        </w:rPr>
+        <w:t>4</w:t>
+      </w:r>
+      <w:r>
+        <w:rPr>
+          <w:rFonts w:ascii="Arial" w:hAnsi="Arial" w:cs="Arial"/>
+          <w:szCs w:val="24"/>
+        </w:rPr>
+        <w:t xml:space="preserve"> </w:t>
       </w:r>
       <w:r>
         <w:rPr>
@@ -4339,7 +3760,14 @@
           <w:rFonts w:ascii="Arial" w:hAnsi="Arial" w:cs="Arial"/>
           <w:szCs w:val="24"/>
         </w:rPr>
-        <w:t>11</w:t>
+        <w:t>1</w:t>
+      </w:r>
+      <w:r>
+        <w:rPr>
+          <w:rFonts w:ascii="Arial" w:hAnsi="Arial" w:cs="Arial"/>
+          <w:szCs w:val="24"/>
+        </w:rPr>
+        <w:t>0</w:t>
       </w:r>
       <w:r>
         <w:rPr>

</xml_diff>